<commit_message>
feat: Adicionado Chatbot Lumi com integração Groq e atualizações de design
</commit_message>
<xml_diff>
--- a/Arquivos/Projeto_Saúde_e_Bem-Estar.docx
+++ b/Arquivos/Projeto_Saúde_e_Bem-Estar.docx
@@ -1276,13 +1276,7 @@
         <w:rPr>
           <w:rFonts w:ascii="Times New Roman" w:hAnsi="Times New Roman" w:cs="Times New Roman"/>
         </w:rPr>
-        <w:t xml:space="preserve">A tipografia utilizada no projeto foi escolhida para transmitir clareza, modernidade e profissionalismo, características importantes em aplicações relacionadas à área da </w:t>
-      </w:r>
-      <w:r>
-        <w:rPr>
-          <w:rFonts w:ascii="Times New Roman" w:hAnsi="Times New Roman" w:cs="Times New Roman"/>
-        </w:rPr>
-        <w:t>saúde.</w:t>
+        <w:t>A tipografia utilizada no projeto foi escolhida para transmitir clareza, modernidade e profissionalismo, características importantes em aplicações relacionadas à área da saúde.</w:t>
       </w:r>
       <w:r>
         <w:rPr>
@@ -1428,18 +1422,19 @@
         <w:jc w:val="both"/>
         <w:rPr>
           <w:rFonts w:ascii="Times New Roman" w:hAnsi="Times New Roman" w:cs="Times New Roman"/>
-        </w:rPr>
-      </w:pPr>
-      <w:r>
-        <w:rPr>
-          <w:rFonts w:ascii="Times New Roman" w:hAnsi="Times New Roman" w:cs="Times New Roman"/>
           <w:noProof/>
         </w:rPr>
+      </w:pPr>
+      <w:r>
+        <w:rPr>
+          <w:rFonts w:ascii="Times New Roman" w:hAnsi="Times New Roman" w:cs="Times New Roman"/>
+          <w:noProof/>
+        </w:rPr>
         <w:drawing>
-          <wp:inline distT="0" distB="0" distL="0" distR="0" wp14:anchorId="74FC0A23" wp14:editId="0E346013">
-            <wp:extent cx="3732395" cy="1917700"/>
-            <wp:effectExtent l="0" t="0" r="1905" b="6350"/>
-            <wp:docPr id="1293737858" name="Imagem 1"/>
+          <wp:inline distT="0" distB="0" distL="0" distR="0" wp14:anchorId="1A87C82D" wp14:editId="06C146C4">
+            <wp:extent cx="2105247" cy="1178879"/>
+            <wp:effectExtent l="0" t="0" r="0" b="2540"/>
+            <wp:docPr id="388417082" name="Imagem 2"/>
             <wp:cNvGraphicFramePr>
               <a:graphicFrameLocks xmlns:a="http://schemas.openxmlformats.org/drawingml/2006/main" noChangeAspect="1"/>
             </wp:cNvGraphicFramePr>
@@ -1447,8 +1442,10 @@
               <a:graphicData uri="http://schemas.openxmlformats.org/drawingml/2006/picture">
                 <pic:pic xmlns:pic="http://schemas.openxmlformats.org/drawingml/2006/picture">
                   <pic:nvPicPr>
-                    <pic:cNvPr id="1293737858" name="Imagem 1293737858"/>
-                    <pic:cNvPicPr/>
+                    <pic:cNvPr id="0" name="Picture 6"/>
+                    <pic:cNvPicPr>
+                      <a:picLocks noChangeAspect="1" noChangeArrowheads="1"/>
+                    </pic:cNvPicPr>
                   </pic:nvPicPr>
                   <pic:blipFill>
                     <a:blip r:embed="rId9" cstate="print">
@@ -1458,18 +1455,23 @@
                         </a:ext>
                       </a:extLst>
                     </a:blip>
+                    <a:srcRect/>
                     <a:stretch>
                       <a:fillRect/>
                     </a:stretch>
                   </pic:blipFill>
-                  <pic:spPr>
+                  <pic:spPr bwMode="auto">
                     <a:xfrm>
                       <a:off x="0" y="0"/>
-                      <a:ext cx="3783828" cy="1944126"/>
+                      <a:ext cx="2119516" cy="1186869"/>
                     </a:xfrm>
                     <a:prstGeom prst="rect">
                       <a:avLst/>
                     </a:prstGeom>
+                    <a:noFill/>
+                    <a:ln>
+                      <a:noFill/>
+                    </a:ln>
                   </pic:spPr>
                 </pic:pic>
               </a:graphicData>
@@ -1480,6 +1482,16 @@
     </w:p>
     <w:p>
       <w:pPr>
+        <w:spacing w:after="0"/>
+        <w:ind w:firstLine="360"/>
+        <w:jc w:val="both"/>
+        <w:rPr>
+          <w:rFonts w:ascii="Times New Roman" w:hAnsi="Times New Roman" w:cs="Times New Roman"/>
+        </w:rPr>
+      </w:pPr>
+    </w:p>
+    <w:p>
+      <w:pPr>
         <w:rPr>
           <w:rFonts w:ascii="Times New Roman" w:eastAsiaTheme="majorEastAsia" w:hAnsi="Times New Roman" w:cs="Times New Roman"/>
           <w:b/>
@@ -1513,6 +1525,7 @@
           <w:sz w:val="24"/>
           <w:szCs w:val="24"/>
         </w:rPr>
+        <w:lastRenderedPageBreak/>
         <w:t>METODOLOGIA</w:t>
       </w:r>
       <w:bookmarkEnd w:id="6"/>
@@ -1536,6 +1549,38 @@
           <w:szCs w:val="24"/>
         </w:rPr>
         <w:t>Foi escolhido o método Kanban para o projeto porque este é extremamente visual e flexível, o que auxilia de forma significativa na organização do trabalho e na comunicação da equipe. Com o Kanban, é possível visualizar todas as tarefas em um quadro, divididas em colunas como “Para Fazer”, “Fazendo” e “Feito”. Isso permite acompanhar exatamente o andamento do projeto, evitando que algo seja esquecido ou atrasado.</w:t>
+      </w:r>
+    </w:p>
+    <w:p>
+      <w:pPr>
+        <w:spacing w:after="0"/>
+        <w:ind w:firstLine="360"/>
+        <w:jc w:val="both"/>
+        <w:rPr>
+          <w:rFonts w:ascii="Times New Roman" w:hAnsi="Times New Roman" w:cs="Times New Roman"/>
+          <w:sz w:val="24"/>
+          <w:szCs w:val="24"/>
+        </w:rPr>
+      </w:pPr>
+    </w:p>
+    <w:p>
+      <w:pPr>
+        <w:spacing w:after="0"/>
+        <w:ind w:firstLine="360"/>
+        <w:jc w:val="both"/>
+        <w:rPr>
+          <w:rFonts w:ascii="Times New Roman" w:hAnsi="Times New Roman" w:cs="Times New Roman"/>
+          <w:sz w:val="24"/>
+          <w:szCs w:val="24"/>
+        </w:rPr>
+      </w:pPr>
+      <w:r>
+        <w:rPr>
+          <w:rFonts w:ascii="Times New Roman" w:hAnsi="Times New Roman" w:cs="Times New Roman"/>
+          <w:sz w:val="24"/>
+          <w:szCs w:val="24"/>
+        </w:rPr>
+        <w:t>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</w:t>
       </w:r>
     </w:p>
     <w:p>

</xml_diff>